<commit_message>
Add demo homepage; misc bug fixes, video scripts
</commit_message>
<xml_diff>
--- a/docs/video_scripts/BODAQS_Desktop_Install_and_Workbench_Launch_Draft.docx
+++ b/docs/video_scripts/BODAQS_Desktop_Install_and_Workbench_Launch_Draft.docx
@@ -1,8 +1,8 @@
 
 <file path=word/document.xml><?xml version="1.0" encoding="utf-8"?>
-<w:document xmlns:mc="http://schemas.openxmlformats.org/markup-compatibility/2006" xmlns:ns2="http://schemas.microsoft.com/office/word/2010/wordml" xmlns:w="http://schemas.openxmlformats.org/wordprocessingml/2006/main" mc:Ignorable="w14 w15 w16se w16cid w16 w16cex w16sdtdh w16sdtfl w16du wp14">
+<w:document xmlns:wpc="http://schemas.microsoft.com/office/word/2010/wordprocessingCanvas" xmlns:cx="http://schemas.microsoft.com/office/drawing/2014/chartex" xmlns:cx1="http://schemas.microsoft.com/office/drawing/2015/9/8/chartex" xmlns:cx2="http://schemas.microsoft.com/office/drawing/2015/10/21/chartex" xmlns:cx3="http://schemas.microsoft.com/office/drawing/2016/5/9/chartex" xmlns:cx4="http://schemas.microsoft.com/office/drawing/2016/5/10/chartex" xmlns:cx5="http://schemas.microsoft.com/office/drawing/2016/5/11/chartex" xmlns:cx6="http://schemas.microsoft.com/office/drawing/2016/5/12/chartex" xmlns:cx7="http://schemas.microsoft.com/office/drawing/2016/5/13/chartex" xmlns:cx8="http://schemas.microsoft.com/office/drawing/2016/5/14/chartex" xmlns:mc="http://schemas.openxmlformats.org/markup-compatibility/2006" xmlns:aink="http://schemas.microsoft.com/office/drawing/2016/ink" xmlns:am3d="http://schemas.microsoft.com/office/drawing/2017/model3d" xmlns:o="urn:schemas-microsoft-com:office:office" xmlns:oel="http://schemas.microsoft.com/office/2019/extlst" xmlns:r="http://schemas.openxmlformats.org/officeDocument/2006/relationships" xmlns:m="http://schemas.openxmlformats.org/officeDocument/2006/math" xmlns:v="urn:schemas-microsoft-com:vml" xmlns:wp14="http://schemas.microsoft.com/office/word/2010/wordprocessingDrawing" xmlns:wp="http://schemas.openxmlformats.org/drawingml/2006/wordprocessingDrawing" xmlns:w10="urn:schemas-microsoft-com:office:word" xmlns:w="http://schemas.openxmlformats.org/wordprocessingml/2006/main" xmlns:w14="http://schemas.microsoft.com/office/word/2010/wordml" xmlns:w15="http://schemas.microsoft.com/office/word/2012/wordml" xmlns:w16cei="http://schemas.microsoft.com/office/word/2026/wordml/cei" xmlns:w16cex="http://schemas.microsoft.com/office/word/2018/wordml/cex" xmlns:w16cid="http://schemas.microsoft.com/office/word/2016/wordml/cid" xmlns:w16="http://schemas.microsoft.com/office/word/2018/wordml" xmlns:w16du="http://schemas.microsoft.com/office/word/2023/wordml/word16du" xmlns:w16sdtdh="http://schemas.microsoft.com/office/word/2020/wordml/sdtdatahash" xmlns:w16sdtfl="http://schemas.microsoft.com/office/word/2024/wordml/sdtformatlock" xmlns:w16se="http://schemas.microsoft.com/office/word/2015/wordml/symex" xmlns:wpg="http://schemas.microsoft.com/office/word/2010/wordprocessingGroup" xmlns:wpi="http://schemas.microsoft.com/office/word/2010/wordprocessingInk" xmlns:wne="http://schemas.microsoft.com/office/word/2006/wordml" xmlns:wps="http://schemas.microsoft.com/office/word/2010/wordprocessingShape" mc:Ignorable="w14 w15 w16se w16cid w16 w16cex w16sdtdh w16sdtfl w16du wp14">
   <w:body>
-    <w:p ns2:paraId="7A6F6E05" ns2:textId="77777777">
+    <w:p>
       <w:pPr>
         <w:jc w:val="center"/>
       </w:pPr>
@@ -15,7 +15,7 @@
         <w:t>BODAQS Desktop Install Package - Video 1 Draft Script</w:t>
       </w:r>
     </w:p>
-    <w:p ns2:paraId="1FDCAE87" ns2:textId="77777777">
+    <w:p>
       <w:pPr>
         <w:spacing w:after="260"/>
         <w:jc w:val="center"/>
@@ -24,7 +24,7 @@
         <w:t>Bare installation and opening the BODAQS Workbench web app</w:t>
       </w:r>
     </w:p>
-    <w:p ns2:paraId="70203C7E" ns2:textId="77777777">
+    <w:p>
       <w:pPr>
         <w:spacing w:after="120"/>
       </w:pPr>
@@ -35,7 +35,7 @@
         <w:t>Production Notes</w:t>
       </w:r>
     </w:p>
-    <w:p ns2:paraId="1FBDAA9B" ns2:textId="77777777">
+    <w:p>
       <w:pPr>
         <w:spacing w:after="100"/>
       </w:pPr>
@@ -43,15 +43,23 @@
         <w:t>1. Scope: install BODAQS Desktop, launch BODAQS Import Manager, and open the bundled BODAQS Workbench web app in the browser. Do not cover logger provisioning, imports, analysis, or Workbench usage.</w:t>
       </w:r>
     </w:p>
-    <w:p ns2:paraId="4A46C776" ns2:textId="77777777">
+    <w:p>
       <w:pPr>
         <w:spacing w:after="100"/>
       </w:pPr>
       <w:r>
-        <w:t>2. Current build note: the Workbench button is enabled only after a managed workspace exists. This draft treats the first-run Create Default Workspace click as a minimal launch prerequisite, not a provisioning lesson. For a literal zero-workspace-step recording, preconfigure the machine before filming.</w:t>
+        <w:t xml:space="preserve">2. Current build note: the Workbench button is enabled only after a managed workspace exists. This draft treats the </w:t>
+      </w:r>
+      <w:proofErr w:type="gramStart"/>
+      <w:r>
+        <w:t>first-run</w:t>
+      </w:r>
+      <w:proofErr w:type="gramEnd"/>
+      <w:r>
+        <w:t xml:space="preserve"> Create Default Workspace click as a minimal launch prerequisite, not a provisioning lesson. For a literal zero-workspace-step recording, preconfigure the machine before filming.</w:t>
       </w:r>
     </w:p>
-    <w:p ns2:paraId="185EDAD4" ns2:textId="77777777">
+    <w:p>
       <w:pPr>
         <w:spacing w:after="100"/>
       </w:pPr>
@@ -59,7 +67,7 @@
         <w:t>3. Version note: this draft is based on the current Windows bundle found locally as bodaqs-desktop-setup-0.1.6-dev.exe. Replace the version text in the final take if the release file name changes.</w:t>
       </w:r>
     </w:p>
-    <w:p ns2:paraId="09FDAC25" ns2:textId="77777777">
+    <w:p>
       <w:pPr>
         <w:spacing w:after="100"/>
       </w:pPr>
@@ -67,7 +75,7 @@
         <w:t>4. Prompt note: Windows UAC or SmartScreen may appear depending on signing and local policy. Include it only if it appears during recording.</w:t>
       </w:r>
     </w:p>
-    <w:p ns2:paraId="63C1B299" ns2:textId="77777777">
+    <w:p>
       <w:pPr>
         <w:spacing w:after="120"/>
       </w:pPr>
@@ -100,13 +108,7 @@
         <w:gridCol w:w="4700"/>
         <w:gridCol w:w="4900"/>
       </w:tblGrid>
-      <w:tr ns2:paraId="4897B3AF" ns2:textId="77777777">
-        <w:tblPrEx>
-          <w:tblCellMar>
-            <w:top w:w="0" w:type="dxa"/>
-            <w:bottom w:w="0" w:type="dxa"/>
-          </w:tblCellMar>
-        </w:tblPrEx>
+      <w:tr>
         <w:tc>
           <w:tcPr>
             <w:tcW w:w="4700" w:type="dxa"/>
@@ -118,7 +120,7 @@
               <w:right w:w="90" w:type="dxa"/>
             </w:tcMar>
           </w:tcPr>
-          <w:p ns2:paraId="18ED8967" ns2:textId="77777777">
+          <w:p>
             <w:pPr>
               <w:spacing w:after="80"/>
             </w:pPr>
@@ -143,7 +145,7 @@
               <w:right w:w="90" w:type="dxa"/>
             </w:tcMar>
           </w:tcPr>
-          <w:p ns2:paraId="6BBCE485" ns2:textId="77777777">
+          <w:p>
             <w:pPr>
               <w:spacing w:after="80"/>
             </w:pPr>
@@ -158,13 +160,7 @@
           </w:p>
         </w:tc>
       </w:tr>
-      <w:tr ns2:paraId="4579C43B" ns2:textId="77777777">
-        <w:tblPrEx>
-          <w:tblCellMar>
-            <w:top w:w="0" w:type="dxa"/>
-            <w:bottom w:w="0" w:type="dxa"/>
-          </w:tblCellMar>
-        </w:tblPrEx>
+      <w:tr>
         <w:tc>
           <w:tcPr>
             <w:tcW w:w="4700" w:type="dxa"/>
@@ -194,23 +190,20 @@
               <w:right w:w="90" w:type="dxa"/>
             </w:tcMar>
           </w:tcPr>
-          <w:p ns2:paraId="725BC3F7" ns2:textId="0E7C3AF5">
-            <w:pPr>
-              <w:spacing w:after="80"/>
-            </w:pPr>
-            <w:r>
-              <w:t>I’m Ben, the creator of BODAQS. BODAQS is an open source mountain bike data acquisition project focused on making professional analysis tools affordable and accessible – whether you’re chasing performance at the cutting edge or, like me, just curious to know what’s really going on.</w:t>
+          <w:p>
+            <w:pPr>
+              <w:spacing w:after="80"/>
+            </w:pPr>
+            <w:r>
+              <w:t xml:space="preserve">BODAQS is an open source mountain bike data acquisition project focused on making professional analysis tools affordable and </w:t>
+            </w:r>
+            <w:r>
+              <w:t>accessible.</w:t>
             </w:r>
           </w:p>
         </w:tc>
       </w:tr>
-      <w:tr ns2:paraId="41FB51F1" ns2:textId="77777777">
-        <w:tblPrEx>
-          <w:tblCellMar>
-            <w:top w:w="0" w:type="dxa"/>
-            <w:bottom w:w="0" w:type="dxa"/>
-          </w:tblCellMar>
-        </w:tblPrEx>
+      <w:tr>
         <w:tc>
           <w:tcPr>
             <w:tcW w:w="4700" w:type="dxa"/>
@@ -240,65 +233,282 @@
               <w:right w:w="90" w:type="dxa"/>
             </w:tcMar>
           </w:tcPr>
-          <w:p ns2:paraId="4F6071D2" ns2:textId="4DDC1CDA">
-            <w:pPr>
-              <w:spacing w:after="80"/>
-            </w:pPr>
-            <w:r>
-              <w:t>In t</w:t>
-            </w:r>
-            <w:r>
-              <w:t xml:space="preserve">his short walkthrough </w:t>
-            </w:r>
-            <w:r>
-              <w:t xml:space="preserve">we will download and </w:t>
+          <w:p>
+            <w:pPr>
+              <w:spacing w:after="80"/>
+            </w:pPr>
+            <w:r>
+              <w:t xml:space="preserve">In this short walkthrough we will download and install the BODAQS Desktop </w:t>
+            </w:r>
+            <w:r>
+              <w:t>software package</w:t>
+            </w:r>
+            <w:r>
+              <w:t>. In later videos we will cover connecting a logger, importing data and running analysis.</w:t>
+            </w:r>
+          </w:p>
+        </w:tc>
+      </w:tr>
+      <w:tr>
+        <w:tc>
+          <w:tcPr>
+            <w:tcW w:w="4700" w:type="dxa"/>
+            <w:tcMar>
+              <w:top w:w="90" w:type="dxa"/>
+              <w:left w:w="90" w:type="dxa"/>
+              <w:bottom w:w="90" w:type="dxa"/>
+              <w:right w:w="90" w:type="dxa"/>
+            </w:tcMar>
+          </w:tcPr>
+          <w:p>
+            <w:pPr>
+              <w:spacing w:after="80"/>
+            </w:pPr>
+            <w:r>
+              <w:t>[0:29-0:50] In the browser: go to github.com, search BODAQS, open the BODAQS repository, open Releases, and download the latest BODAQS Desktop executable.</w:t>
+            </w:r>
+          </w:p>
+        </w:tc>
+        <w:tc>
+          <w:tcPr>
+            <w:tcW w:w="4900" w:type="dxa"/>
+            <w:tcMar>
+              <w:top w:w="90" w:type="dxa"/>
+              <w:left w:w="90" w:type="dxa"/>
+              <w:bottom w:w="90" w:type="dxa"/>
+              <w:right w:w="90" w:type="dxa"/>
+            </w:tcMar>
+          </w:tcPr>
+          <w:p>
+            <w:pPr>
+              <w:spacing w:after="80"/>
+            </w:pPr>
+            <w:r>
+              <w:t xml:space="preserve">Start by downloading the latest BODAQS Desktop package from the BODAQS </w:t>
+            </w:r>
+            <w:proofErr w:type="spellStart"/>
+            <w:r>
+              <w:t>github</w:t>
+            </w:r>
+            <w:proofErr w:type="spellEnd"/>
+            <w:r>
+              <w:t xml:space="preserve"> repository. Go to Github.com; search BODAQS and head to the Releases page. Find the latest Desktop release and download the executable.</w:t>
+            </w:r>
+          </w:p>
+        </w:tc>
+      </w:tr>
+      <w:tr>
+        <w:tc>
+          <w:tcPr>
+            <w:tcW w:w="4700" w:type="dxa"/>
+            <w:tcMar>
+              <w:top w:w="90" w:type="dxa"/>
+              <w:left w:w="90" w:type="dxa"/>
+              <w:bottom w:w="90" w:type="dxa"/>
+              <w:right w:w="90" w:type="dxa"/>
+            </w:tcMar>
+          </w:tcPr>
+          <w:p>
+            <w:pPr>
+              <w:spacing w:after="80"/>
+            </w:pPr>
+            <w:r>
+              <w:t>[0:50-1:07] Downloads folder. Double-click the downloaded BODAQS Desktop installer. Show UAC or SmartScreen only if it appears, then continue.</w:t>
+            </w:r>
+          </w:p>
+        </w:tc>
+        <w:tc>
+          <w:tcPr>
+            <w:tcW w:w="4900" w:type="dxa"/>
+            <w:tcMar>
+              <w:top w:w="90" w:type="dxa"/>
+              <w:left w:w="90" w:type="dxa"/>
+              <w:bottom w:w="90" w:type="dxa"/>
+              <w:right w:w="90" w:type="dxa"/>
+            </w:tcMar>
+          </w:tcPr>
+          <w:p>
+            <w:pPr>
+              <w:spacing w:after="80"/>
+            </w:pPr>
+            <w:r>
+              <w:t>Double-click the BODAQS Desktop installer. If Windows asks for permission, continue only if you downloaded the installer from the official BODAQS release location.</w:t>
+            </w:r>
+            <w:r>
+              <w:br/>
+              <w:t xml:space="preserve">See the notes at the end of this video for how </w:t>
+            </w:r>
+            <w:r>
+              <w:lastRenderedPageBreak/>
+              <w:t>to verify that the package is safe to install.</w:t>
+            </w:r>
+          </w:p>
+        </w:tc>
+      </w:tr>
+      <w:tr>
+        <w:tc>
+          <w:tcPr>
+            <w:tcW w:w="4700" w:type="dxa"/>
+            <w:tcMar>
+              <w:top w:w="90" w:type="dxa"/>
+              <w:left w:w="90" w:type="dxa"/>
+              <w:bottom w:w="90" w:type="dxa"/>
+              <w:right w:w="90" w:type="dxa"/>
+            </w:tcMar>
+          </w:tcPr>
+          <w:p>
+            <w:pPr>
+              <w:spacing w:after="80"/>
+            </w:pPr>
+            <w:r>
+              <w:lastRenderedPageBreak/>
+              <w:t>[1:07-1:20] BODAQS Desktop Setup opens. Move through the welcome page toward the install options.</w:t>
+            </w:r>
+          </w:p>
+        </w:tc>
+        <w:tc>
+          <w:tcPr>
+            <w:tcW w:w="4900" w:type="dxa"/>
+            <w:tcMar>
+              <w:top w:w="90" w:type="dxa"/>
+              <w:left w:w="90" w:type="dxa"/>
+              <w:bottom w:w="90" w:type="dxa"/>
+              <w:right w:w="90" w:type="dxa"/>
+            </w:tcMar>
+          </w:tcPr>
+          <w:p>
+            <w:pPr>
+              <w:spacing w:after="80"/>
+            </w:pPr>
+            <w:r>
+              <w:t xml:space="preserve">The installer packages </w:t>
+            </w:r>
+            <w:r>
+              <w:t xml:space="preserve">several components: </w:t>
+            </w:r>
+            <w:r>
+              <w:t>the BODAQS Import Manager</w:t>
+            </w:r>
+            <w:r>
+              <w:t xml:space="preserve"> and </w:t>
+            </w:r>
+            <w:r>
+              <w:t>local Library Service, the BODAQS Workbench web app</w:t>
+            </w:r>
+            <w:r>
+              <w:t>, and an optional sample library so you can try out the software without needing a BODAQS logger</w:t>
+            </w:r>
+            <w:r>
+              <w:t>.</w:t>
+            </w:r>
+          </w:p>
+        </w:tc>
+      </w:tr>
+      <w:tr>
+        <w:tc>
+          <w:tcPr>
+            <w:tcW w:w="4700" w:type="dxa"/>
+            <w:tcMar>
+              <w:top w:w="90" w:type="dxa"/>
+              <w:left w:w="90" w:type="dxa"/>
+              <w:bottom w:w="90" w:type="dxa"/>
+              <w:right w:w="90" w:type="dxa"/>
+            </w:tcMar>
+          </w:tcPr>
+          <w:p>
+            <w:pPr>
+              <w:spacing w:after="80"/>
+            </w:pPr>
+            <w:r>
+              <w:t>[1:20-1:26] Destination Location page. Leave the default Program Files install folder and click Next.</w:t>
+            </w:r>
+          </w:p>
+        </w:tc>
+        <w:tc>
+          <w:tcPr>
+            <w:tcW w:w="4900" w:type="dxa"/>
+            <w:tcMar>
+              <w:top w:w="90" w:type="dxa"/>
+              <w:left w:w="90" w:type="dxa"/>
+              <w:bottom w:w="90" w:type="dxa"/>
+              <w:right w:w="90" w:type="dxa"/>
+            </w:tcMar>
+          </w:tcPr>
+          <w:p>
+            <w:pPr>
+              <w:spacing w:after="80"/>
+            </w:pPr>
+            <w:r>
+              <w:t xml:space="preserve">Accept the default install folder unless </w:t>
+            </w:r>
+            <w:r>
+              <w:t xml:space="preserve">you prefer </w:t>
+            </w:r>
+            <w:r>
+              <w:t>a different location.</w:t>
+            </w:r>
+          </w:p>
+        </w:tc>
+      </w:tr>
+      <w:tr>
+        <w:tc>
+          <w:tcPr>
+            <w:tcW w:w="4700" w:type="dxa"/>
+            <w:tcMar>
+              <w:top w:w="90" w:type="dxa"/>
+              <w:left w:w="90" w:type="dxa"/>
+              <w:bottom w:w="90" w:type="dxa"/>
+              <w:right w:w="90" w:type="dxa"/>
+            </w:tcMar>
+          </w:tcPr>
+          <w:p>
+            <w:pPr>
+              <w:spacing w:after="80"/>
+            </w:pPr>
+            <w:r>
+              <w:t>[1:26-1:36] Additional Tasks page. Leave the demo library option selected; tick desktop shortcut only if desired; click Next.</w:t>
+            </w:r>
+          </w:p>
+        </w:tc>
+        <w:tc>
+          <w:tcPr>
+            <w:tcW w:w="4900" w:type="dxa"/>
+            <w:tcMar>
+              <w:top w:w="90" w:type="dxa"/>
+              <w:left w:w="90" w:type="dxa"/>
+              <w:bottom w:w="90" w:type="dxa"/>
+              <w:right w:w="90" w:type="dxa"/>
+            </w:tcMar>
+          </w:tcPr>
+          <w:p>
+            <w:pPr>
+              <w:spacing w:after="80"/>
+            </w:pPr>
+            <w:r>
+              <w:t xml:space="preserve">Choose whether to create a desktop shortcut. For a first </w:t>
             </w:r>
             <w:r>
               <w:t>install</w:t>
             </w:r>
             <w:r>
-              <w:t xml:space="preserve"> the</w:t>
-            </w:r>
-            <w:r>
-              <w:t xml:space="preserve"> BODAQS Desktop </w:t>
-            </w:r>
-            <w:r>
-              <w:t>software package</w:t>
-            </w:r>
-            <w:r>
-              <w:t xml:space="preserve">. In later videos we will cover connecting </w:t>
-            </w:r>
-            <w:r>
-              <w:t>a logger, import</w:t>
+              <w:t xml:space="preserve">, </w:t>
+            </w:r>
+            <w:r>
+              <w:t xml:space="preserve">we recommend </w:t>
+            </w:r>
+            <w:r>
+              <w:t>keep</w:t>
             </w:r>
             <w:r>
               <w:t>ing</w:t>
             </w:r>
             <w:r>
-              <w:t xml:space="preserve"> data </w:t>
-            </w:r>
-            <w:r>
-              <w:t xml:space="preserve">and </w:t>
-            </w:r>
-            <w:r>
-              <w:t>run</w:t>
-            </w:r>
-            <w:r>
-              <w:t>ning</w:t>
-            </w:r>
-            <w:r>
-              <w:t xml:space="preserve"> analysis.</w:t>
+              <w:t xml:space="preserve"> the demo library option selected.</w:t>
             </w:r>
           </w:p>
         </w:tc>
       </w:tr>
-      <w:tr ns2:paraId="56FCC44E" ns2:textId="77777777">
-        <w:tblPrEx>
-          <w:tblCellMar>
-            <w:top w:w="0" w:type="dxa"/>
-            <w:bottom w:w="0" w:type="dxa"/>
-          </w:tblCellMar>
-        </w:tblPrEx>
+      <w:tr>
         <w:tc>
           <w:tcPr>
             <w:tcW w:w="4700" w:type="dxa"/>
@@ -314,7 +524,7 @@
               <w:spacing w:after="80"/>
             </w:pPr>
             <w:r>
-              <w:t>[0:29-0:50] In the browser: go to github.com, search BODAQS, open the BODAQS repository, open Releases, and download the latest BODAQS Desktop executable.</w:t>
+              <w:t>[1:36-1:55] Ready to Install, then install progress. Use a quick cut or time-lapse while files copy.</w:t>
             </w:r>
           </w:p>
         </w:tc>
@@ -328,23 +538,17 @@
               <w:right w:w="90" w:type="dxa"/>
             </w:tcMar>
           </w:tcPr>
-          <w:p ns2:paraId="1791FF53" ns2:textId="07D1DEB7">
-            <w:pPr>
-              <w:spacing w:after="80"/>
-            </w:pPr>
-            <w:r>
-              <w:t>Start by downloading the latest BODAQS Desktop package from the BODAQS github repository. Go to Github.com; search BODAQS and head to the Releases page. Find the latest Desktop release and download the executable.</w:t>
+          <w:p>
+            <w:pPr>
+              <w:spacing w:after="80"/>
+            </w:pPr>
+            <w:r>
+              <w:t xml:space="preserve">Click Install and wait for the files to copy. </w:t>
             </w:r>
           </w:p>
         </w:tc>
       </w:tr>
-      <w:tr ns2:paraId="3223BB8F" ns2:textId="77777777">
-        <w:tblPrEx>
-          <w:tblCellMar>
-            <w:top w:w="0" w:type="dxa"/>
-            <w:bottom w:w="0" w:type="dxa"/>
-          </w:tblCellMar>
-        </w:tblPrEx>
+      <w:tr>
         <w:tc>
           <w:tcPr>
             <w:tcW w:w="4700" w:type="dxa"/>
@@ -360,7 +564,7 @@
               <w:spacing w:after="80"/>
             </w:pPr>
             <w:r>
-              <w:t>[0:50-1:07] Downloads folder. Double-click the downloaded BODAQS Desktop installer. Show UAC or SmartScreen only if it appears, then continue.</w:t>
+              <w:t>[1:55-2:02] Completing Setup page. Keep Launch BODAQS Import Manager selected and click Finish.</w:t>
             </w:r>
           </w:p>
         </w:tc>
@@ -374,36 +578,17 @@
               <w:right w:w="90" w:type="dxa"/>
             </w:tcMar>
           </w:tcPr>
-          <w:p ns2:paraId="07A3CE08" ns2:textId="33783F95">
-            <w:pPr>
-              <w:spacing w:after="80"/>
-            </w:pPr>
-            <w:r>
-              <w:t xml:space="preserve">Double-click the </w:t>
-            </w:r>
-            <w:r>
-              <w:t xml:space="preserve">BODAQS Desktop installer. If Windows asks for permission, continue only </w:t>
-            </w:r>
-            <w:r>
-              <w:t xml:space="preserve">if you downloaded the installer from the official </w:t>
-            </w:r>
-            <w:r>
-              <w:t>BODAQS release location.</w:t>
-            </w:r>
-            <w:r>
-              <w:br/>
-              <w:t>See the notes at the end of this video for how to verify that the package is safe to install.</w:t>
+          <w:p>
+            <w:pPr>
+              <w:spacing w:after="80"/>
+            </w:pPr>
+            <w:r>
+              <w:t xml:space="preserve">Leave Launch BODAQS Import Manager selected and click Finish. </w:t>
             </w:r>
           </w:p>
         </w:tc>
       </w:tr>
-      <w:tr ns2:paraId="748B0748" ns2:textId="77777777">
-        <w:tblPrEx>
-          <w:tblCellMar>
-            <w:top w:w="0" w:type="dxa"/>
-            <w:bottom w:w="0" w:type="dxa"/>
-          </w:tblCellMar>
-        </w:tblPrEx>
+      <w:tr>
         <w:tc>
           <w:tcPr>
             <w:tcW w:w="4700" w:type="dxa"/>
@@ -419,7 +604,7 @@
               <w:spacing w:after="80"/>
             </w:pPr>
             <w:r>
-              <w:t>[1:07-1:20] BODAQS Desktop Setup opens. Move through the welcome page toward the install options.</w:t>
+              <w:t>[2:02-2:18] BODAQS Import Manager opens on the Manager tab. Default/demo library rows are already present. Avoid the Provision tab.</w:t>
             </w:r>
           </w:p>
         </w:tc>
@@ -433,41 +618,22 @@
               <w:right w:w="90" w:type="dxa"/>
             </w:tcMar>
           </w:tcPr>
-          <w:p ns2:paraId="500F4305" ns2:textId="511DCF0B">
-            <w:pPr>
-              <w:spacing w:after="80"/>
-            </w:pPr>
-            <w:r>
-              <w:t xml:space="preserve">The installer packages </w:t>
-            </w:r>
-            <w:r>
-              <w:t xml:space="preserve">several components: </w:t>
-            </w:r>
-            <w:r>
-              <w:t>the BODAQS Import Manager</w:t>
-            </w:r>
-            <w:r>
-              <w:t xml:space="preserve"> and </w:t>
-            </w:r>
-            <w:r>
-              <w:t>local Library Service, the BODAQS Workbench web app</w:t>
-            </w:r>
-            <w:r>
-              <w:t>, and an optional sample library so you can try out the software without needing a BODAQS logger</w:t>
-            </w:r>
-            <w:r>
-              <w:t>.</w:t>
-            </w:r>
+          <w:p>
+            <w:pPr>
+              <w:spacing w:after="80"/>
+            </w:pPr>
+            <w:r>
+              <w:t>The BODAQS import manager is an application that runs on your computer and handles the import and pre-processing of files from your logger. We will cover configuration of the Import Manager in a later video.</w:t>
+            </w:r>
+          </w:p>
+          <w:p>
+            <w:pPr>
+              <w:spacing w:after="80"/>
+            </w:pPr>
           </w:p>
         </w:tc>
       </w:tr>
-      <w:tr ns2:paraId="4765CC1E" ns2:textId="77777777">
-        <w:tblPrEx>
-          <w:tblCellMar>
-            <w:top w:w="0" w:type="dxa"/>
-            <w:bottom w:w="0" w:type="dxa"/>
-          </w:tblCellMar>
-        </w:tblPrEx>
+      <w:tr>
         <w:tc>
           <w:tcPr>
             <w:tcW w:w="4700" w:type="dxa"/>
@@ -483,7 +649,7 @@
               <w:spacing w:after="80"/>
             </w:pPr>
             <w:r>
-              <w:t>[1:20-1:26] Destination Location page. Leave the default Program Files install folder and click Next.</w:t>
+              <w:t>[2:18-2:38] Briefly hold on the Manager tab. Cursor points to Libraries/Sources, then to Open BODAQS Workbench. Do not start watch mode or import.</w:t>
             </w:r>
           </w:p>
         </w:tc>
@@ -497,29 +663,25 @@
               <w:right w:w="90" w:type="dxa"/>
             </w:tcMar>
           </w:tcPr>
-          <w:p ns2:paraId="570073C2" ns2:textId="0CB28A99">
-            <w:pPr>
-              <w:spacing w:after="80"/>
-            </w:pPr>
-            <w:r>
-              <w:t xml:space="preserve">Accept the default install folder unless </w:t>
-            </w:r>
-            <w:r>
-              <w:t xml:space="preserve">you prefer </w:t>
-            </w:r>
-            <w:r>
-              <w:t>a different location.</w:t>
+          <w:p>
+            <w:pPr>
+              <w:spacing w:after="80"/>
+            </w:pPr>
+            <w:r>
+              <w:t xml:space="preserve">For now, just note the general functions of the import manager: collecting log files from one or more loggers via file copy or </w:t>
+            </w:r>
+            <w:proofErr w:type="spellStart"/>
+            <w:r>
+              <w:t>wifi</w:t>
+            </w:r>
+            <w:proofErr w:type="spellEnd"/>
+            <w:r>
+              <w:t>; pre-processing the data for easy presentation; matching and attaching GPS data from Garmin devices, and attaching bike setup notes from your template.</w:t>
             </w:r>
           </w:p>
         </w:tc>
       </w:tr>
-      <w:tr ns2:paraId="0AAFB74D" ns2:textId="77777777">
-        <w:tblPrEx>
-          <w:tblCellMar>
-            <w:top w:w="0" w:type="dxa"/>
-            <w:bottom w:w="0" w:type="dxa"/>
-          </w:tblCellMar>
-        </w:tblPrEx>
+      <w:tr>
         <w:tc>
           <w:tcPr>
             <w:tcW w:w="4700" w:type="dxa"/>
@@ -535,7 +697,11 @@
               <w:spacing w:after="80"/>
             </w:pPr>
             <w:r>
-              <w:t>[1:26-1:36] Additional Tasks page. Leave the demo library option selected; tick desktop shortcut only if desired; click Next.</w:t>
+              <w:t xml:space="preserve">[2:38-2:45] Click Open BODAQS Workbench. Wait for the browser tab to </w:t>
+            </w:r>
+            <w:r>
+              <w:lastRenderedPageBreak/>
+              <w:t>open.</w:t>
             </w:r>
           </w:p>
         </w:tc>
@@ -549,41 +715,84 @@
               <w:right w:w="90" w:type="dxa"/>
             </w:tcMar>
           </w:tcPr>
-          <w:p ns2:paraId="6D8B0E47" ns2:textId="60DF2436">
-            <w:pPr>
-              <w:spacing w:after="80"/>
-            </w:pPr>
-            <w:r>
-              <w:t xml:space="preserve">Choose whether to create a desktop shortcut. For a first </w:t>
-            </w:r>
-            <w:r>
-              <w:t>install</w:t>
+          <w:p>
+            <w:pPr>
+              <w:spacing w:after="80"/>
+            </w:pPr>
+            <w:r>
+              <w:lastRenderedPageBreak/>
+              <w:t xml:space="preserve">Click Open BODAQS Workbench. </w:t>
+            </w:r>
+            <w:r>
+              <w:t xml:space="preserve">This opens the BODAQS Workbench analysis app </w:t>
+            </w:r>
+            <w:r>
+              <w:t xml:space="preserve">in your </w:t>
+            </w:r>
+            <w:r>
+              <w:lastRenderedPageBreak/>
+              <w:t xml:space="preserve">web </w:t>
+            </w:r>
+            <w:r>
+              <w:t>browser.</w:t>
+            </w:r>
+          </w:p>
+        </w:tc>
+      </w:tr>
+      <w:tr>
+        <w:tc>
+          <w:tcPr>
+            <w:tcW w:w="4700" w:type="dxa"/>
+            <w:tcMar>
+              <w:top w:w="90" w:type="dxa"/>
+              <w:left w:w="90" w:type="dxa"/>
+              <w:bottom w:w="90" w:type="dxa"/>
+              <w:right w:w="90" w:type="dxa"/>
+            </w:tcMar>
+          </w:tcPr>
+          <w:p>
+            <w:pPr>
+              <w:spacing w:after="80"/>
+            </w:pPr>
+            <w:r>
+              <w:lastRenderedPageBreak/>
+              <w:t>[2:45-2:56] Browser opens to the local Workbench. Hold on Library Browser and Study Set Builder while the demo library/session list loads.</w:t>
+            </w:r>
+          </w:p>
+        </w:tc>
+        <w:tc>
+          <w:tcPr>
+            <w:tcW w:w="4900" w:type="dxa"/>
+            <w:tcMar>
+              <w:top w:w="90" w:type="dxa"/>
+              <w:left w:w="90" w:type="dxa"/>
+              <w:bottom w:w="90" w:type="dxa"/>
+              <w:right w:w="90" w:type="dxa"/>
+            </w:tcMar>
+          </w:tcPr>
+          <w:p>
+            <w:pPr>
+              <w:spacing w:after="80"/>
+            </w:pPr>
+            <w:r>
+              <w:t>When the browser opens</w:t>
             </w:r>
             <w:r>
               <w:t xml:space="preserve">, </w:t>
             </w:r>
             <w:r>
-              <w:t xml:space="preserve">we recommend </w:t>
-            </w:r>
-            <w:r>
-              <w:t>keep</w:t>
-            </w:r>
-            <w:r>
-              <w:t>ing</w:t>
-            </w:r>
-            <w:r>
-              <w:t xml:space="preserve"> the demo library option selected.</w:t>
+              <w:t>the Library Browser and Study Set Builder screen appears</w:t>
+            </w:r>
+            <w:r>
+              <w:t>. After a couple of seconds, the demo library should load.</w:t>
+            </w:r>
+            <w:r>
+              <w:t xml:space="preserve"> </w:t>
             </w:r>
           </w:p>
         </w:tc>
       </w:tr>
-      <w:tr ns2:paraId="0DA3382D" ns2:textId="77777777">
-        <w:tblPrEx>
-          <w:tblCellMar>
-            <w:top w:w="0" w:type="dxa"/>
-            <w:bottom w:w="0" w:type="dxa"/>
-          </w:tblCellMar>
-        </w:tblPrEx>
+      <w:tr>
         <w:tc>
           <w:tcPr>
             <w:tcW w:w="4700" w:type="dxa"/>
@@ -599,7 +808,7 @@
               <w:spacing w:after="80"/>
             </w:pPr>
             <w:r>
-              <w:t>[1:36-1:55] Ready to Install, then install progress. Use a quick cut or time-lapse while files copy.</w:t>
+              <w:t>[2:56-3:07] Hold on the loaded demo data in Workbench. Do not click into analysis; optionally move the cursor over the visible run/session table.</w:t>
             </w:r>
           </w:p>
         </w:tc>
@@ -613,23 +822,17 @@
               <w:right w:w="90" w:type="dxa"/>
             </w:tcMar>
           </w:tcPr>
-          <w:p ns2:paraId="347BD4E6" ns2:textId="6B7D09F3">
-            <w:pPr>
-              <w:spacing w:after="80"/>
-            </w:pPr>
-            <w:r>
-              <w:t xml:space="preserve">Click Install and wait for the files to copy. </w:t>
+          <w:p>
+            <w:pPr>
+              <w:spacing w:after="80"/>
+            </w:pPr>
+            <w:r>
+              <w:t>In the next video, we will examine the runs in the demo library and demonstrate some of the features of the BODAQS Workbench analysis app.</w:t>
             </w:r>
           </w:p>
         </w:tc>
       </w:tr>
-      <w:tr ns2:paraId="4D119F7E" ns2:textId="77777777">
-        <w:tblPrEx>
-          <w:tblCellMar>
-            <w:top w:w="0" w:type="dxa"/>
-            <w:bottom w:w="0" w:type="dxa"/>
-          </w:tblCellMar>
-        </w:tblPrEx>
+      <w:tr>
         <w:tc>
           <w:tcPr>
             <w:tcW w:w="4700" w:type="dxa"/>
@@ -645,7 +848,7 @@
               <w:spacing w:after="80"/>
             </w:pPr>
             <w:r>
-              <w:t>[1:55-2:02] Completing Setup page. Keep Launch BODAQS Import Manager selected and click Finish.</w:t>
+              <w:t>[3:07-3:17] Outro to camera or simple end card with bodaqs.net, Instagram, and Discord.</w:t>
             </w:r>
           </w:p>
         </w:tc>
@@ -659,313 +862,7 @@
               <w:right w:w="90" w:type="dxa"/>
             </w:tcMar>
           </w:tcPr>
-          <w:p ns2:paraId="5133D8D1" ns2:textId="36F3A36B">
-            <w:pPr>
-              <w:spacing w:after="80"/>
-            </w:pPr>
-            <w:r>
-              <w:t xml:space="preserve">Leave Launch BODAQS Import Manager selected and click Finish. </w:t>
-            </w:r>
-          </w:p>
-        </w:tc>
-      </w:tr>
-      <w:tr ns2:paraId="0E04B2E0" ns2:textId="77777777">
-        <w:tblPrEx>
-          <w:tblCellMar>
-            <w:top w:w="0" w:type="dxa"/>
-            <w:bottom w:w="0" w:type="dxa"/>
-          </w:tblCellMar>
-        </w:tblPrEx>
-        <w:tc>
-          <w:tcPr>
-            <w:tcW w:w="4700" w:type="dxa"/>
-            <w:tcMar>
-              <w:top w:w="90" w:type="dxa"/>
-              <w:left w:w="90" w:type="dxa"/>
-              <w:bottom w:w="90" w:type="dxa"/>
-              <w:right w:w="90" w:type="dxa"/>
-            </w:tcMar>
-          </w:tcPr>
-          <w:p>
-            <w:pPr>
-              <w:spacing w:after="80"/>
-            </w:pPr>
-            <w:r>
-              <w:t>[2:02-2:18] BODAQS Import Manager opens on the Manager tab. Default/demo library rows are already present. Avoid the Provision tab.</w:t>
-            </w:r>
-          </w:p>
-        </w:tc>
-        <w:tc>
-          <w:tcPr>
-            <w:tcW w:w="4900" w:type="dxa"/>
-            <w:tcMar>
-              <w:top w:w="90" w:type="dxa"/>
-              <w:left w:w="90" w:type="dxa"/>
-              <w:bottom w:w="90" w:type="dxa"/>
-              <w:right w:w="90" w:type="dxa"/>
-            </w:tcMar>
-          </w:tcPr>
-          <w:p ns2:paraId="7E1302F0" ns2:textId="6643FDD6">
-            <w:pPr>
-              <w:spacing w:after="80"/>
-            </w:pPr>
-            <w:r>
-              <w:t>The BODAQS import manager is an application that runs on your computer and handles the import and pre-processing of files from your logger. We will cover configuration of the Import Manager in a later video.</w:t>
-            </w:r>
-          </w:p>
-          <w:p ns2:paraId="542441FF" ns2:textId="596DECB5">
-            <w:pPr>
-              <w:spacing w:after="80"/>
-            </w:pPr>
-          </w:p>
-        </w:tc>
-      </w:tr>
-      <w:tr ns2:paraId="1CF6FB7A" ns2:textId="77777777">
-        <w:tblPrEx>
-          <w:tblCellMar>
-            <w:top w:w="0" w:type="dxa"/>
-            <w:bottom w:w="0" w:type="dxa"/>
-          </w:tblCellMar>
-        </w:tblPrEx>
-        <w:tc>
-          <w:tcPr>
-            <w:tcW w:w="4700" w:type="dxa"/>
-            <w:tcMar>
-              <w:top w:w="90" w:type="dxa"/>
-              <w:left w:w="90" w:type="dxa"/>
-              <w:bottom w:w="90" w:type="dxa"/>
-              <w:right w:w="90" w:type="dxa"/>
-            </w:tcMar>
-          </w:tcPr>
-          <w:p>
-            <w:pPr>
-              <w:spacing w:after="80"/>
-            </w:pPr>
-            <w:r>
-              <w:t>[2:18-2:38] Briefly hold on the Manager tab. Cursor points to Libraries/Sources, then to Open BODAQS Workbench. Do not start watch mode or import.</w:t>
-            </w:r>
-          </w:p>
-        </w:tc>
-        <w:tc>
-          <w:tcPr>
-            <w:tcW w:w="4900" w:type="dxa"/>
-            <w:tcMar>
-              <w:top w:w="90" w:type="dxa"/>
-              <w:left w:w="90" w:type="dxa"/>
-              <w:bottom w:w="90" w:type="dxa"/>
-              <w:right w:w="90" w:type="dxa"/>
-            </w:tcMar>
-          </w:tcPr>
-          <w:p ns2:paraId="20E56F99" ns2:textId="62134234">
-            <w:pPr>
-              <w:spacing w:after="80"/>
-            </w:pPr>
-            <w:r>
-              <w:t>For now, just note the general functions of the import manager: collecting log files from one or more loggers via file copy or wifi; pre-processing the data for easy presentation; matching and attaching GPS data from Garmin devices, and attaching bike setup notes from your template.</w:t>
-            </w:r>
-          </w:p>
-        </w:tc>
-      </w:tr>
-      <w:tr ns2:paraId="788BBBF7" ns2:textId="77777777">
-        <w:tblPrEx>
-          <w:tblCellMar>
-            <w:top w:w="0" w:type="dxa"/>
-            <w:bottom w:w="0" w:type="dxa"/>
-          </w:tblCellMar>
-        </w:tblPrEx>
-        <w:tc>
-          <w:tcPr>
-            <w:tcW w:w="4700" w:type="dxa"/>
-            <w:tcMar>
-              <w:top w:w="90" w:type="dxa"/>
-              <w:left w:w="90" w:type="dxa"/>
-              <w:bottom w:w="90" w:type="dxa"/>
-              <w:right w:w="90" w:type="dxa"/>
-            </w:tcMar>
-          </w:tcPr>
-          <w:p>
-            <w:pPr>
-              <w:spacing w:after="80"/>
-            </w:pPr>
-            <w:r>
-              <w:t>[2:38-2:45] Click Open BODAQS Workbench. Wait for the browser tab to open.</w:t>
-            </w:r>
-          </w:p>
-        </w:tc>
-        <w:tc>
-          <w:tcPr>
-            <w:tcW w:w="4900" w:type="dxa"/>
-            <w:tcMar>
-              <w:top w:w="90" w:type="dxa"/>
-              <w:left w:w="90" w:type="dxa"/>
-              <w:bottom w:w="90" w:type="dxa"/>
-              <w:right w:w="90" w:type="dxa"/>
-            </w:tcMar>
-          </w:tcPr>
-          <w:p ns2:paraId="6D5532D3" ns2:textId="36165B32">
-            <w:pPr>
-              <w:spacing w:after="80"/>
-            </w:pPr>
-            <w:r>
-              <w:t xml:space="preserve">Click Open BODAQS Workbench. </w:t>
-            </w:r>
-            <w:r>
-              <w:t xml:space="preserve">This opens the BODAQS Workbench analysis app </w:t>
-            </w:r>
-            <w:r>
-              <w:t xml:space="preserve">in your </w:t>
-            </w:r>
-            <w:r>
-              <w:t xml:space="preserve">web </w:t>
-            </w:r>
-            <w:r>
-              <w:t>browser.</w:t>
-            </w:r>
-          </w:p>
-        </w:tc>
-      </w:tr>
-      <w:tr ns2:paraId="6D57A6C3" ns2:textId="77777777">
-        <w:tblPrEx>
-          <w:tblCellMar>
-            <w:top w:w="0" w:type="dxa"/>
-            <w:bottom w:w="0" w:type="dxa"/>
-          </w:tblCellMar>
-        </w:tblPrEx>
-        <w:tc>
-          <w:tcPr>
-            <w:tcW w:w="4700" w:type="dxa"/>
-            <w:tcMar>
-              <w:top w:w="90" w:type="dxa"/>
-              <w:left w:w="90" w:type="dxa"/>
-              <w:bottom w:w="90" w:type="dxa"/>
-              <w:right w:w="90" w:type="dxa"/>
-            </w:tcMar>
-          </w:tcPr>
-          <w:p>
-            <w:pPr>
-              <w:spacing w:after="80"/>
-            </w:pPr>
-            <w:r>
-              <w:t>[2:45-2:56] Browser opens to the local Workbench. Hold on Library Browser and Study Set Builder while the demo library/session list loads.</w:t>
-            </w:r>
-          </w:p>
-        </w:tc>
-        <w:tc>
-          <w:tcPr>
-            <w:tcW w:w="4900" w:type="dxa"/>
-            <w:tcMar>
-              <w:top w:w="90" w:type="dxa"/>
-              <w:left w:w="90" w:type="dxa"/>
-              <w:bottom w:w="90" w:type="dxa"/>
-              <w:right w:w="90" w:type="dxa"/>
-            </w:tcMar>
-          </w:tcPr>
-          <w:p ns2:paraId="39F7AA93" ns2:textId="3E526E89">
-            <w:pPr>
-              <w:spacing w:after="80"/>
-            </w:pPr>
-            <w:r>
-              <w:lastRenderedPageBreak/>
-              <w:t>When the browser opens</w:t>
-            </w:r>
-            <w:r>
-              <w:t xml:space="preserve">, </w:t>
-            </w:r>
-            <w:r>
-              <w:t>the Library Browser and Study Set Builder screen appears</w:t>
-            </w:r>
-            <w:r>
-              <w:t>. After a couple of seconds, the demo library should load.</w:t>
-            </w:r>
-            <w:r>
-              <w:t xml:space="preserve"> </w:t>
-            </w:r>
-          </w:p>
-        </w:tc>
-      </w:tr>
-      <w:tr ns2:paraId="7F8B7535" ns2:textId="77777777">
-        <w:tblPrEx>
-          <w:tblCellMar>
-            <w:top w:w="0" w:type="dxa"/>
-            <w:bottom w:w="0" w:type="dxa"/>
-          </w:tblCellMar>
-        </w:tblPrEx>
-        <w:tc>
-          <w:tcPr>
-            <w:tcW w:w="4700" w:type="dxa"/>
-            <w:tcMar>
-              <w:top w:w="90" w:type="dxa"/>
-              <w:left w:w="90" w:type="dxa"/>
-              <w:bottom w:w="90" w:type="dxa"/>
-              <w:right w:w="90" w:type="dxa"/>
-            </w:tcMar>
-          </w:tcPr>
-          <w:p>
-            <w:pPr>
-              <w:spacing w:after="80"/>
-            </w:pPr>
-            <w:r>
-              <w:t>[2:56-3:07] Hold on the loaded demo data in Workbench. Do not click into analysis; optionally move the cursor over the visible run/session table.</w:t>
-            </w:r>
-          </w:p>
-        </w:tc>
-        <w:tc>
-          <w:tcPr>
-            <w:tcW w:w="4900" w:type="dxa"/>
-            <w:tcMar>
-              <w:top w:w="90" w:type="dxa"/>
-              <w:left w:w="90" w:type="dxa"/>
-              <w:bottom w:w="90" w:type="dxa"/>
-              <w:right w:w="90" w:type="dxa"/>
-            </w:tcMar>
-          </w:tcPr>
-          <w:p ns2:paraId="2357EF7E" ns2:textId="4AED2D02">
-            <w:pPr>
-              <w:spacing w:after="80"/>
-            </w:pPr>
-            <w:r>
-              <w:t>In the next video, we will examine the runs in the demo library and demonstrate some of the features of the BODAQS Workbench analysis app.</w:t>
-            </w:r>
-          </w:p>
-        </w:tc>
-      </w:tr>
-      <w:tr ns2:paraId="64AD57CC" ns2:textId="77777777">
-        <w:tblPrEx>
-          <w:tblCellMar>
-            <w:top w:w="0" w:type="dxa"/>
-            <w:bottom w:w="0" w:type="dxa"/>
-          </w:tblCellMar>
-        </w:tblPrEx>
-        <w:tc>
-          <w:tcPr>
-            <w:tcW w:w="4700" w:type="dxa"/>
-            <w:tcMar>
-              <w:top w:w="90" w:type="dxa"/>
-              <w:left w:w="90" w:type="dxa"/>
-              <w:bottom w:w="90" w:type="dxa"/>
-              <w:right w:w="90" w:type="dxa"/>
-            </w:tcMar>
-          </w:tcPr>
-          <w:p>
-            <w:pPr>
-              <w:spacing w:after="80"/>
-            </w:pPr>
-            <w:r>
-              <w:t>[3:07-3:17] Outro to camera or simple end card with bodaqs.net, Instagram, and Discord.</w:t>
-            </w:r>
-          </w:p>
-        </w:tc>
-        <w:tc>
-          <w:tcPr>
-            <w:tcW w:w="4900" w:type="dxa"/>
-            <w:tcMar>
-              <w:top w:w="90" w:type="dxa"/>
-              <w:left w:w="90" w:type="dxa"/>
-              <w:bottom w:w="90" w:type="dxa"/>
-              <w:right w:w="90" w:type="dxa"/>
-            </w:tcMar>
-          </w:tcPr>
-          <w:p ns2:paraId="73963648" ns2:textId="358D5C1D">
+          <w:p>
             <w:pPr>
               <w:spacing w:after="80"/>
             </w:pPr>
@@ -980,7 +877,7 @@
         </w:tc>
       </w:tr>
     </w:tbl>
-    <w:p ns2:paraId="690E1FD3" ns2:textId="77777777"/>
+    <w:p/>
     <w:sectPr>
       <w:pgSz w:w="12240" w:h="15840"/>
       <w:pgMar w:top="720" w:right="720" w:bottom="720" w:left="720" w:header="360" w:footer="360" w:gutter="0"/>

</xml_diff>